<commit_message>
Added Scope and Functional Requirements - Uma
</commit_message>
<xml_diff>
--- a/Documents/PRS GL document.docx
+++ b/Documents/PRS GL document.docx
@@ -226,6 +226,671 @@
         <w:t>Within 30 days, 75–85% of invoices are auto-structured, validated, and ready for export with minimal review.</w:t>
       </w:r>
     </w:p>
+    <w:p>
+      <w:pPr>
+        <w:rPr>
+          <w:b/>
+          <w:bCs/>
+          <w:sz w:val="24"/>
+          <w:szCs w:val="24"/>
+        </w:rPr>
+      </w:pPr>
+      <w:r>
+        <w:rPr>
+          <w:b/>
+          <w:bCs/>
+          <w:sz w:val="24"/>
+          <w:szCs w:val="24"/>
+        </w:rPr>
+        <w:t>2. Scope Definition</w:t>
+      </w:r>
+    </w:p>
+    <w:p>
+      <w:pPr>
+        <w:rPr>
+          <w:b/>
+          <w:bCs/>
+        </w:rPr>
+      </w:pPr>
+      <w:r>
+        <w:rPr>
+          <w:b/>
+          <w:bCs/>
+        </w:rPr>
+        <w:t>2.1 In-Scope Capabilities</w:t>
+      </w:r>
+    </w:p>
+    <w:p>
+      <w:pPr>
+        <w:ind w:left="360"/>
+      </w:pPr>
+      <w:r>
+        <w:t>The proposed system provides an AI-enabled solution to support MSMEs and accountants in managing invoice data and compliance readiness.</w:t>
+      </w:r>
+    </w:p>
+    <w:p>
+      <w:pPr>
+        <w:ind w:left="360"/>
+      </w:pPr>
+      <w:r>
+        <w:t>Key capabilities include:</w:t>
+      </w:r>
+    </w:p>
+    <w:p>
+      <w:pPr>
+        <w:numPr>
+          <w:ilvl w:val="0"/>
+          <w:numId w:val="49"/>
+        </w:numPr>
+      </w:pPr>
+      <w:r>
+        <w:t xml:space="preserve">Accept invoices in image and PDF formats </w:t>
+      </w:r>
+    </w:p>
+    <w:p>
+      <w:pPr>
+        <w:numPr>
+          <w:ilvl w:val="0"/>
+          <w:numId w:val="49"/>
+        </w:numPr>
+      </w:pPr>
+      <w:r>
+        <w:t xml:space="preserve">Extract structured data from unstructured invoices using OCR and AI </w:t>
+      </w:r>
+    </w:p>
+    <w:p>
+      <w:pPr>
+        <w:numPr>
+          <w:ilvl w:val="0"/>
+          <w:numId w:val="49"/>
+        </w:numPr>
+      </w:pPr>
+      <w:r>
+        <w:t xml:space="preserve">Detect missing and duplicate invoice records </w:t>
+      </w:r>
+    </w:p>
+    <w:p>
+      <w:pPr>
+        <w:numPr>
+          <w:ilvl w:val="0"/>
+          <w:numId w:val="49"/>
+        </w:numPr>
+      </w:pPr>
+      <w:r>
+        <w:t xml:space="preserve">Automatically categorize invoices into accounting-relevant categories </w:t>
+      </w:r>
+    </w:p>
+    <w:p>
+      <w:pPr>
+        <w:numPr>
+          <w:ilvl w:val="0"/>
+          <w:numId w:val="49"/>
+        </w:numPr>
+      </w:pPr>
+      <w:r>
+        <w:t xml:space="preserve">Generate compliance risk score based on data completeness and submission behaviour </w:t>
+      </w:r>
+    </w:p>
+    <w:p>
+      <w:pPr>
+        <w:numPr>
+          <w:ilvl w:val="0"/>
+          <w:numId w:val="49"/>
+        </w:numPr>
+      </w:pPr>
+      <w:r>
+        <w:t xml:space="preserve">Provide deadline notifications for GST compliance activities </w:t>
+      </w:r>
+    </w:p>
+    <w:p>
+      <w:pPr>
+        <w:numPr>
+          <w:ilvl w:val="0"/>
+          <w:numId w:val="49"/>
+        </w:numPr>
+      </w:pPr>
+      <w:r>
+        <w:t xml:space="preserve">Generate structured outputs such as Excel or CSV for accounting usage </w:t>
+      </w:r>
+    </w:p>
+    <w:p>
+      <w:pPr>
+        <w:numPr>
+          <w:ilvl w:val="0"/>
+          <w:numId w:val="49"/>
+        </w:numPr>
+      </w:pPr>
+      <w:r>
+        <w:lastRenderedPageBreak/>
+        <w:t xml:space="preserve">Provide a centralized dashboard for monitoring invoice processing and compliance status </w:t>
+      </w:r>
+      <w:r>
+        <w:t>.</w:t>
+      </w:r>
+    </w:p>
+    <w:p>
+      <w:pPr>
+        <w:rPr>
+          <w:b/>
+          <w:bCs/>
+        </w:rPr>
+      </w:pPr>
+      <w:r>
+        <w:rPr>
+          <w:b/>
+          <w:bCs/>
+        </w:rPr>
+        <w:t>2.2 Out-of-Scope Capabilities</w:t>
+      </w:r>
+    </w:p>
+    <w:p>
+      <w:r>
+        <w:t>To maintain feasibility within project scope, the system does not include:</w:t>
+      </w:r>
+    </w:p>
+    <w:p>
+      <w:pPr>
+        <w:numPr>
+          <w:ilvl w:val="0"/>
+          <w:numId w:val="50"/>
+        </w:numPr>
+      </w:pPr>
+      <w:r>
+        <w:t xml:space="preserve">Direct real-time integration with government GST portal </w:t>
+      </w:r>
+    </w:p>
+    <w:p>
+      <w:pPr>
+        <w:numPr>
+          <w:ilvl w:val="0"/>
+          <w:numId w:val="50"/>
+        </w:numPr>
+      </w:pPr>
+      <w:r>
+        <w:t xml:space="preserve">Full replacement of accounting software systems </w:t>
+      </w:r>
+    </w:p>
+    <w:p>
+      <w:pPr>
+        <w:numPr>
+          <w:ilvl w:val="0"/>
+          <w:numId w:val="50"/>
+        </w:numPr>
+      </w:pPr>
+      <w:r>
+        <w:t xml:space="preserve">Real-time financial transaction processing </w:t>
+      </w:r>
+    </w:p>
+    <w:p>
+      <w:pPr>
+        <w:numPr>
+          <w:ilvl w:val="0"/>
+          <w:numId w:val="50"/>
+        </w:numPr>
+      </w:pPr>
+      <w:r>
+        <w:t xml:space="preserve">Multi-country tax compliance support </w:t>
+      </w:r>
+    </w:p>
+    <w:p>
+      <w:pPr>
+        <w:numPr>
+          <w:ilvl w:val="0"/>
+          <w:numId w:val="50"/>
+        </w:numPr>
+      </w:pPr>
+      <w:r>
+        <w:t xml:space="preserve">Advanced predictive financial analytics </w:t>
+      </w:r>
+    </w:p>
+    <w:p>
+      <w:pPr>
+        <w:rPr>
+          <w:b/>
+          <w:bCs/>
+          <w:sz w:val="24"/>
+          <w:szCs w:val="24"/>
+        </w:rPr>
+      </w:pPr>
+      <w:r>
+        <w:rPr>
+          <w:b/>
+          <w:bCs/>
+          <w:sz w:val="24"/>
+          <w:szCs w:val="24"/>
+        </w:rPr>
+        <w:t>3. Functional Requirements</w:t>
+      </w:r>
+    </w:p>
+    <w:p>
+      <w:pPr>
+        <w:rPr>
+          <w:b/>
+          <w:bCs/>
+        </w:rPr>
+      </w:pPr>
+      <w:r>
+        <w:rPr>
+          <w:b/>
+          <w:bCs/>
+        </w:rPr>
+        <w:t>3.1 Core Functional Capabilities</w:t>
+      </w:r>
+    </w:p>
+    <w:p>
+      <w:r>
+        <w:t>The system shall:</w:t>
+      </w:r>
+    </w:p>
+    <w:p>
+      <w:pPr>
+        <w:numPr>
+          <w:ilvl w:val="0"/>
+          <w:numId w:val="51"/>
+        </w:numPr>
+      </w:pPr>
+      <w:r>
+        <w:t xml:space="preserve">Allow users to upload invoices in supported formats </w:t>
+      </w:r>
+    </w:p>
+    <w:p>
+      <w:pPr>
+        <w:numPr>
+          <w:ilvl w:val="0"/>
+          <w:numId w:val="51"/>
+        </w:numPr>
+      </w:pPr>
+      <w:r>
+        <w:t xml:space="preserve">Extract key invoice details such as vendor name, invoice date, amount, and tax information </w:t>
+      </w:r>
+    </w:p>
+    <w:p>
+      <w:pPr>
+        <w:numPr>
+          <w:ilvl w:val="0"/>
+          <w:numId w:val="51"/>
+        </w:numPr>
+      </w:pPr>
+      <w:r>
+        <w:t xml:space="preserve">Identify missing invoice data and allow manual correction </w:t>
+      </w:r>
+    </w:p>
+    <w:p>
+      <w:pPr>
+        <w:numPr>
+          <w:ilvl w:val="0"/>
+          <w:numId w:val="51"/>
+        </w:numPr>
+      </w:pPr>
+      <w:r>
+        <w:t xml:space="preserve">Detect duplicate invoices using defined matching criteria </w:t>
+      </w:r>
+    </w:p>
+    <w:p>
+      <w:pPr>
+        <w:numPr>
+          <w:ilvl w:val="0"/>
+          <w:numId w:val="51"/>
+        </w:numPr>
+      </w:pPr>
+      <w:r>
+        <w:t xml:space="preserve">Categorize invoices using predefined rules and AI-based classification </w:t>
+      </w:r>
+    </w:p>
+    <w:p>
+      <w:pPr>
+        <w:numPr>
+          <w:ilvl w:val="0"/>
+          <w:numId w:val="51"/>
+        </w:numPr>
+      </w:pPr>
+      <w:r>
+        <w:t xml:space="preserve">Calculate and update compliance risk score dynamically </w:t>
+      </w:r>
+    </w:p>
+    <w:p>
+      <w:pPr>
+        <w:numPr>
+          <w:ilvl w:val="0"/>
+          <w:numId w:val="51"/>
+        </w:numPr>
+      </w:pPr>
+      <w:r>
+        <w:t xml:space="preserve">Generate reminders for compliance deadlines </w:t>
+      </w:r>
+    </w:p>
+    <w:p>
+      <w:pPr>
+        <w:numPr>
+          <w:ilvl w:val="0"/>
+          <w:numId w:val="51"/>
+        </w:numPr>
+      </w:pPr>
+      <w:r>
+        <w:t xml:space="preserve">Store and export validated invoice data in structured format </w:t>
+      </w:r>
+    </w:p>
+    <w:p>
+      <w:pPr>
+        <w:numPr>
+          <w:ilvl w:val="0"/>
+          <w:numId w:val="51"/>
+        </w:numPr>
+      </w:pPr>
+      <w:r>
+        <w:t>Display processing status and compliance alerts in a dashboard</w:t>
+      </w:r>
+      <w:r>
+        <w:t>.</w:t>
+      </w:r>
+    </w:p>
+    <w:p>
+      <w:pPr>
+        <w:rPr>
+          <w:b/>
+          <w:bCs/>
+        </w:rPr>
+      </w:pPr>
+      <w:r>
+        <w:rPr>
+          <w:b/>
+          <w:bCs/>
+        </w:rPr>
+        <w:t>3.2 Functional Workflows</w:t>
+      </w:r>
+    </w:p>
+    <w:p>
+      <w:pPr>
+        <w:rPr>
+          <w:b/>
+          <w:bCs/>
+        </w:rPr>
+      </w:pPr>
+      <w:r>
+        <w:rPr>
+          <w:b/>
+          <w:bCs/>
+        </w:rPr>
+        <w:t>Invoice Processing Workflow</w:t>
+      </w:r>
+    </w:p>
+    <w:p>
+      <w:pPr>
+        <w:numPr>
+          <w:ilvl w:val="0"/>
+          <w:numId w:val="52"/>
+        </w:numPr>
+      </w:pPr>
+      <w:r>
+        <w:t xml:space="preserve">User uploads invoice </w:t>
+      </w:r>
+    </w:p>
+    <w:p>
+      <w:pPr>
+        <w:numPr>
+          <w:ilvl w:val="0"/>
+          <w:numId w:val="52"/>
+        </w:numPr>
+      </w:pPr>
+      <w:r>
+        <w:t xml:space="preserve">System extracts invoice data </w:t>
+      </w:r>
+    </w:p>
+    <w:p>
+      <w:pPr>
+        <w:numPr>
+          <w:ilvl w:val="0"/>
+          <w:numId w:val="52"/>
+        </w:numPr>
+      </w:pPr>
+      <w:r>
+        <w:t xml:space="preserve">System validates completeness of required fields </w:t>
+      </w:r>
+    </w:p>
+    <w:p>
+      <w:pPr>
+        <w:numPr>
+          <w:ilvl w:val="0"/>
+          <w:numId w:val="52"/>
+        </w:numPr>
+      </w:pPr>
+      <w:r>
+        <w:t xml:space="preserve">System checks for duplicate entries </w:t>
+      </w:r>
+    </w:p>
+    <w:p>
+      <w:pPr>
+        <w:numPr>
+          <w:ilvl w:val="0"/>
+          <w:numId w:val="52"/>
+        </w:numPr>
+      </w:pPr>
+      <w:r>
+        <w:t xml:space="preserve">System categorizes invoice </w:t>
+      </w:r>
+    </w:p>
+    <w:p>
+      <w:pPr>
+        <w:numPr>
+          <w:ilvl w:val="0"/>
+          <w:numId w:val="52"/>
+        </w:numPr>
+      </w:pPr>
+      <w:r>
+        <w:t xml:space="preserve">System updates compliance risk score </w:t>
+      </w:r>
+    </w:p>
+    <w:p>
+      <w:pPr>
+        <w:numPr>
+          <w:ilvl w:val="0"/>
+          <w:numId w:val="52"/>
+        </w:numPr>
+      </w:pPr>
+      <w:r>
+        <w:t xml:space="preserve">System stores processed data </w:t>
+      </w:r>
+    </w:p>
+    <w:p>
+      <w:pPr>
+        <w:numPr>
+          <w:ilvl w:val="0"/>
+          <w:numId w:val="52"/>
+        </w:numPr>
+      </w:pPr>
+      <w:r>
+        <w:t xml:space="preserve">Dashboard reflects updated processing status </w:t>
+      </w:r>
+    </w:p>
+    <w:p>
+      <w:pPr>
+        <w:rPr>
+          <w:b/>
+          <w:bCs/>
+        </w:rPr>
+      </w:pPr>
+      <w:r>
+        <w:rPr>
+          <w:b/>
+          <w:bCs/>
+        </w:rPr>
+        <w:lastRenderedPageBreak/>
+        <w:t>Compliance Notification Workflow</w:t>
+      </w:r>
+    </w:p>
+    <w:p>
+      <w:pPr>
+        <w:numPr>
+          <w:ilvl w:val="0"/>
+          <w:numId w:val="53"/>
+        </w:numPr>
+      </w:pPr>
+      <w:r>
+        <w:t xml:space="preserve">System maintains compliance calendar </w:t>
+      </w:r>
+    </w:p>
+    <w:p>
+      <w:pPr>
+        <w:numPr>
+          <w:ilvl w:val="0"/>
+          <w:numId w:val="53"/>
+        </w:numPr>
+      </w:pPr>
+      <w:r>
+        <w:t xml:space="preserve">System monitors invoice upload status </w:t>
+      </w:r>
+    </w:p>
+    <w:p>
+      <w:pPr>
+        <w:numPr>
+          <w:ilvl w:val="0"/>
+          <w:numId w:val="53"/>
+        </w:numPr>
+      </w:pPr>
+      <w:r>
+        <w:t xml:space="preserve">System generates reminders before deadlines </w:t>
+      </w:r>
+    </w:p>
+    <w:p>
+      <w:pPr>
+        <w:numPr>
+          <w:ilvl w:val="0"/>
+          <w:numId w:val="53"/>
+        </w:numPr>
+      </w:pPr>
+      <w:r>
+        <w:t>User receives alert and takes necessary action</w:t>
+      </w:r>
+    </w:p>
+    <w:p>
+      <w:pPr>
+        <w:rPr>
+          <w:b/>
+          <w:bCs/>
+        </w:rPr>
+      </w:pPr>
+      <w:r>
+        <w:rPr>
+          <w:b/>
+          <w:bCs/>
+        </w:rPr>
+        <w:t>3.3 Business Rules &amp; Logic</w:t>
+      </w:r>
+    </w:p>
+    <w:p>
+      <w:pPr>
+        <w:numPr>
+          <w:ilvl w:val="0"/>
+          <w:numId w:val="54"/>
+        </w:numPr>
+      </w:pPr>
+      <w:r>
+        <w:t xml:space="preserve">Compliance risk score is influenced by invoice completeness, duplication, and timeliness of uploads </w:t>
+      </w:r>
+    </w:p>
+    <w:p>
+      <w:pPr>
+        <w:numPr>
+          <w:ilvl w:val="0"/>
+          <w:numId w:val="54"/>
+        </w:numPr>
+      </w:pPr>
+      <w:r>
+        <w:t xml:space="preserve">Mandatory invoice fields must be verified before data export </w:t>
+      </w:r>
+    </w:p>
+    <w:p>
+      <w:pPr>
+        <w:numPr>
+          <w:ilvl w:val="0"/>
+          <w:numId w:val="54"/>
+        </w:numPr>
+      </w:pPr>
+      <w:r>
+        <w:t xml:space="preserve">Duplicate invoices are identified using invoice number, vendor details, and amount similarity </w:t>
+      </w:r>
+    </w:p>
+    <w:p>
+      <w:pPr>
+        <w:numPr>
+          <w:ilvl w:val="0"/>
+          <w:numId w:val="54"/>
+        </w:numPr>
+      </w:pPr>
+      <w:r>
+        <w:t>Notifications are triggered based on predefined compliance schedule</w:t>
+      </w:r>
+    </w:p>
+    <w:p>
+      <w:pPr>
+        <w:rPr>
+          <w:b/>
+          <w:bCs/>
+        </w:rPr>
+      </w:pPr>
+      <w:r>
+        <w:rPr>
+          <w:b/>
+          <w:bCs/>
+        </w:rPr>
+        <w:t>3.4 Functional Acceptance Criteria</w:t>
+      </w:r>
+    </w:p>
+    <w:p>
+      <w:pPr>
+        <w:numPr>
+          <w:ilvl w:val="0"/>
+          <w:numId w:val="55"/>
+        </w:numPr>
+      </w:pPr>
+      <w:r>
+        <w:t xml:space="preserve">Uploaded invoices are processed and structured successfully </w:t>
+      </w:r>
+    </w:p>
+    <w:p>
+      <w:pPr>
+        <w:numPr>
+          <w:ilvl w:val="0"/>
+          <w:numId w:val="55"/>
+        </w:numPr>
+      </w:pPr>
+      <w:r>
+        <w:t xml:space="preserve">Missing invoice fields are correctly identified and highlighted </w:t>
+      </w:r>
+    </w:p>
+    <w:p>
+      <w:pPr>
+        <w:numPr>
+          <w:ilvl w:val="0"/>
+          <w:numId w:val="55"/>
+        </w:numPr>
+      </w:pPr>
+      <w:r>
+        <w:t xml:space="preserve">Duplicate invoices are flagged accurately </w:t>
+      </w:r>
+    </w:p>
+    <w:p>
+      <w:pPr>
+        <w:numPr>
+          <w:ilvl w:val="0"/>
+          <w:numId w:val="55"/>
+        </w:numPr>
+      </w:pPr>
+      <w:r>
+        <w:t xml:space="preserve">Compliance reminders are generated before due dates </w:t>
+      </w:r>
+    </w:p>
+    <w:p>
+      <w:pPr>
+        <w:numPr>
+          <w:ilvl w:val="0"/>
+          <w:numId w:val="55"/>
+        </w:numPr>
+      </w:pPr>
+      <w:r>
+        <w:t>Structured data export is available without errors</w:t>
+      </w:r>
+    </w:p>
     <w:p/>
     <w:p>
       <w:pPr>
@@ -363,7 +1028,6 @@
         <w:ind w:left="720"/>
       </w:pPr>
       <w:r>
-        <w:lastRenderedPageBreak/>
         <w:t>Risk indicators and validation flags</w:t>
       </w:r>
     </w:p>
@@ -383,6 +1047,7 @@
         <w:ind w:left="720"/>
       </w:pPr>
       <w:r>
+        <w:lastRenderedPageBreak/>
         <w:t>Upload (PDF/Image)</w:t>
       </w:r>
     </w:p>
@@ -652,29 +1317,29 @@
         <w:ind w:left="720"/>
       </w:pPr>
       <w:r>
+        <w:t>Tracking of high-risk or flagged invoices</w:t>
+      </w:r>
+      <w:r>
+        <w:t>.</w:t>
+      </w:r>
+    </w:p>
+    <w:p>
+      <w:pPr>
+        <w:ind w:left="720"/>
+      </w:pPr>
+      <w:r>
+        <w:t>Example</w:t>
+      </w:r>
+      <w:r>
+        <w:t>:</w:t>
+      </w:r>
+    </w:p>
+    <w:p>
+      <w:pPr>
+        <w:ind w:left="720"/>
+      </w:pPr>
+      <w:r>
         <w:lastRenderedPageBreak/>
-        <w:t>Tracking of high-risk or flagged invoices</w:t>
-      </w:r>
-      <w:r>
-        <w:t>.</w:t>
-      </w:r>
-    </w:p>
-    <w:p>
-      <w:pPr>
-        <w:ind w:left="720"/>
-      </w:pPr>
-      <w:r>
-        <w:t>Example</w:t>
-      </w:r>
-      <w:r>
-        <w:t>:</w:t>
-      </w:r>
-    </w:p>
-    <w:p>
-      <w:pPr>
-        <w:ind w:left="720"/>
-      </w:pPr>
-      <w:r>
         <w:t>Alert generated if error rate exceeds threshold</w:t>
       </w:r>
       <w:r>
@@ -982,7 +1647,6 @@
         </w:numPr>
       </w:pPr>
       <w:r>
-        <w:lastRenderedPageBreak/>
         <w:t>Ensure system handles real-world invoice variations</w:t>
       </w:r>
       <w:r>
@@ -1012,6 +1676,7 @@
         </w:numPr>
       </w:pPr>
       <w:r>
+        <w:lastRenderedPageBreak/>
         <w:t>Functional:</w:t>
       </w:r>
     </w:p>
@@ -2554,6 +3219,155 @@
     </w:lvl>
   </w:abstractNum>
   <w:abstractNum w:abstractNumId="9" w15:restartNumberingAfterBreak="0">
+    <w:nsid w:val="1A2C35E8"/>
+    <w:multiLevelType w:val="multilevel"/>
+    <w:tmpl w:val="80A81120"/>
+    <w:lvl w:ilvl="0">
+      <w:start w:val="1"/>
+      <w:numFmt w:val="bullet"/>
+      <w:lvlText w:val=""/>
+      <w:lvlJc w:val="left"/>
+      <w:pPr>
+        <w:tabs>
+          <w:tab w:val="num" w:pos="720"/>
+        </w:tabs>
+        <w:ind w:left="720" w:hanging="360"/>
+      </w:pPr>
+      <w:rPr>
+        <w:rFonts w:ascii="Symbol" w:hAnsi="Symbol" w:hint="default"/>
+        <w:sz w:val="20"/>
+      </w:rPr>
+    </w:lvl>
+    <w:lvl w:ilvl="1" w:tentative="1">
+      <w:start w:val="1"/>
+      <w:numFmt w:val="bullet"/>
+      <w:lvlText w:val="o"/>
+      <w:lvlJc w:val="left"/>
+      <w:pPr>
+        <w:tabs>
+          <w:tab w:val="num" w:pos="1440"/>
+        </w:tabs>
+        <w:ind w:left="1440" w:hanging="360"/>
+      </w:pPr>
+      <w:rPr>
+        <w:rFonts w:ascii="Courier New" w:hAnsi="Courier New" w:hint="default"/>
+        <w:sz w:val="20"/>
+      </w:rPr>
+    </w:lvl>
+    <w:lvl w:ilvl="2" w:tentative="1">
+      <w:start w:val="1"/>
+      <w:numFmt w:val="bullet"/>
+      <w:lvlText w:val=""/>
+      <w:lvlJc w:val="left"/>
+      <w:pPr>
+        <w:tabs>
+          <w:tab w:val="num" w:pos="2160"/>
+        </w:tabs>
+        <w:ind w:left="2160" w:hanging="360"/>
+      </w:pPr>
+      <w:rPr>
+        <w:rFonts w:ascii="Wingdings" w:hAnsi="Wingdings" w:hint="default"/>
+        <w:sz w:val="20"/>
+      </w:rPr>
+    </w:lvl>
+    <w:lvl w:ilvl="3" w:tentative="1">
+      <w:start w:val="1"/>
+      <w:numFmt w:val="bullet"/>
+      <w:lvlText w:val=""/>
+      <w:lvlJc w:val="left"/>
+      <w:pPr>
+        <w:tabs>
+          <w:tab w:val="num" w:pos="2880"/>
+        </w:tabs>
+        <w:ind w:left="2880" w:hanging="360"/>
+      </w:pPr>
+      <w:rPr>
+        <w:rFonts w:ascii="Wingdings" w:hAnsi="Wingdings" w:hint="default"/>
+        <w:sz w:val="20"/>
+      </w:rPr>
+    </w:lvl>
+    <w:lvl w:ilvl="4" w:tentative="1">
+      <w:start w:val="1"/>
+      <w:numFmt w:val="bullet"/>
+      <w:lvlText w:val=""/>
+      <w:lvlJc w:val="left"/>
+      <w:pPr>
+        <w:tabs>
+          <w:tab w:val="num" w:pos="3600"/>
+        </w:tabs>
+        <w:ind w:left="3600" w:hanging="360"/>
+      </w:pPr>
+      <w:rPr>
+        <w:rFonts w:ascii="Wingdings" w:hAnsi="Wingdings" w:hint="default"/>
+        <w:sz w:val="20"/>
+      </w:rPr>
+    </w:lvl>
+    <w:lvl w:ilvl="5" w:tentative="1">
+      <w:start w:val="1"/>
+      <w:numFmt w:val="bullet"/>
+      <w:lvlText w:val=""/>
+      <w:lvlJc w:val="left"/>
+      <w:pPr>
+        <w:tabs>
+          <w:tab w:val="num" w:pos="4320"/>
+        </w:tabs>
+        <w:ind w:left="4320" w:hanging="360"/>
+      </w:pPr>
+      <w:rPr>
+        <w:rFonts w:ascii="Wingdings" w:hAnsi="Wingdings" w:hint="default"/>
+        <w:sz w:val="20"/>
+      </w:rPr>
+    </w:lvl>
+    <w:lvl w:ilvl="6" w:tentative="1">
+      <w:start w:val="1"/>
+      <w:numFmt w:val="bullet"/>
+      <w:lvlText w:val=""/>
+      <w:lvlJc w:val="left"/>
+      <w:pPr>
+        <w:tabs>
+          <w:tab w:val="num" w:pos="5040"/>
+        </w:tabs>
+        <w:ind w:left="5040" w:hanging="360"/>
+      </w:pPr>
+      <w:rPr>
+        <w:rFonts w:ascii="Wingdings" w:hAnsi="Wingdings" w:hint="default"/>
+        <w:sz w:val="20"/>
+      </w:rPr>
+    </w:lvl>
+    <w:lvl w:ilvl="7" w:tentative="1">
+      <w:start w:val="1"/>
+      <w:numFmt w:val="bullet"/>
+      <w:lvlText w:val=""/>
+      <w:lvlJc w:val="left"/>
+      <w:pPr>
+        <w:tabs>
+          <w:tab w:val="num" w:pos="5760"/>
+        </w:tabs>
+        <w:ind w:left="5760" w:hanging="360"/>
+      </w:pPr>
+      <w:rPr>
+        <w:rFonts w:ascii="Wingdings" w:hAnsi="Wingdings" w:hint="default"/>
+        <w:sz w:val="20"/>
+      </w:rPr>
+    </w:lvl>
+    <w:lvl w:ilvl="8" w:tentative="1">
+      <w:start w:val="1"/>
+      <w:numFmt w:val="bullet"/>
+      <w:lvlText w:val=""/>
+      <w:lvlJc w:val="left"/>
+      <w:pPr>
+        <w:tabs>
+          <w:tab w:val="num" w:pos="6480"/>
+        </w:tabs>
+        <w:ind w:left="6480" w:hanging="360"/>
+      </w:pPr>
+      <w:rPr>
+        <w:rFonts w:ascii="Wingdings" w:hAnsi="Wingdings" w:hint="default"/>
+        <w:sz w:val="20"/>
+      </w:rPr>
+    </w:lvl>
+  </w:abstractNum>
+  <w:abstractNum w:abstractNumId="10" w15:restartNumberingAfterBreak="0">
     <w:nsid w:val="1A363183"/>
     <w:multiLevelType w:val="multilevel"/>
     <w:tmpl w:val="3D507076"/>
@@ -2702,7 +3516,7 @@
       </w:rPr>
     </w:lvl>
   </w:abstractNum>
-  <w:abstractNum w:abstractNumId="10" w15:restartNumberingAfterBreak="0">
+  <w:abstractNum w:abstractNumId="11" w15:restartNumberingAfterBreak="0">
     <w:nsid w:val="1A754224"/>
     <w:multiLevelType w:val="multilevel"/>
     <w:tmpl w:val="3A648970"/>
@@ -2851,7 +3665,7 @@
       </w:rPr>
     </w:lvl>
   </w:abstractNum>
-  <w:abstractNum w:abstractNumId="11" w15:restartNumberingAfterBreak="0">
+  <w:abstractNum w:abstractNumId="12" w15:restartNumberingAfterBreak="0">
     <w:nsid w:val="1C2734F7"/>
     <w:multiLevelType w:val="multilevel"/>
     <w:tmpl w:val="43207E16"/>
@@ -3000,7 +3814,7 @@
       </w:rPr>
     </w:lvl>
   </w:abstractNum>
-  <w:abstractNum w:abstractNumId="12" w15:restartNumberingAfterBreak="0">
+  <w:abstractNum w:abstractNumId="13" w15:restartNumberingAfterBreak="0">
     <w:nsid w:val="20AA5AA4"/>
     <w:multiLevelType w:val="multilevel"/>
     <w:tmpl w:val="38266068"/>
@@ -3149,7 +3963,7 @@
       </w:rPr>
     </w:lvl>
   </w:abstractNum>
-  <w:abstractNum w:abstractNumId="13" w15:restartNumberingAfterBreak="0">
+  <w:abstractNum w:abstractNumId="14" w15:restartNumberingAfterBreak="0">
     <w:nsid w:val="20D66007"/>
     <w:multiLevelType w:val="multilevel"/>
     <w:tmpl w:val="851E2EF8"/>
@@ -3298,7 +4112,120 @@
       </w:rPr>
     </w:lvl>
   </w:abstractNum>
-  <w:abstractNum w:abstractNumId="14" w15:restartNumberingAfterBreak="0">
+  <w:abstractNum w:abstractNumId="15" w15:restartNumberingAfterBreak="0">
+    <w:nsid w:val="224B55DC"/>
+    <w:multiLevelType w:val="multilevel"/>
+    <w:tmpl w:val="272E8752"/>
+    <w:lvl w:ilvl="0">
+      <w:start w:val="1"/>
+      <w:numFmt w:val="decimal"/>
+      <w:lvlText w:val="%1."/>
+      <w:lvlJc w:val="left"/>
+      <w:pPr>
+        <w:tabs>
+          <w:tab w:val="num" w:pos="720"/>
+        </w:tabs>
+        <w:ind w:left="720" w:hanging="360"/>
+      </w:pPr>
+    </w:lvl>
+    <w:lvl w:ilvl="1" w:tentative="1">
+      <w:start w:val="1"/>
+      <w:numFmt w:val="decimal"/>
+      <w:lvlText w:val="%2."/>
+      <w:lvlJc w:val="left"/>
+      <w:pPr>
+        <w:tabs>
+          <w:tab w:val="num" w:pos="1440"/>
+        </w:tabs>
+        <w:ind w:left="1440" w:hanging="360"/>
+      </w:pPr>
+    </w:lvl>
+    <w:lvl w:ilvl="2" w:tentative="1">
+      <w:start w:val="1"/>
+      <w:numFmt w:val="decimal"/>
+      <w:lvlText w:val="%3."/>
+      <w:lvlJc w:val="left"/>
+      <w:pPr>
+        <w:tabs>
+          <w:tab w:val="num" w:pos="2160"/>
+        </w:tabs>
+        <w:ind w:left="2160" w:hanging="360"/>
+      </w:pPr>
+    </w:lvl>
+    <w:lvl w:ilvl="3" w:tentative="1">
+      <w:start w:val="1"/>
+      <w:numFmt w:val="decimal"/>
+      <w:lvlText w:val="%4."/>
+      <w:lvlJc w:val="left"/>
+      <w:pPr>
+        <w:tabs>
+          <w:tab w:val="num" w:pos="2880"/>
+        </w:tabs>
+        <w:ind w:left="2880" w:hanging="360"/>
+      </w:pPr>
+    </w:lvl>
+    <w:lvl w:ilvl="4" w:tentative="1">
+      <w:start w:val="1"/>
+      <w:numFmt w:val="decimal"/>
+      <w:lvlText w:val="%5."/>
+      <w:lvlJc w:val="left"/>
+      <w:pPr>
+        <w:tabs>
+          <w:tab w:val="num" w:pos="3600"/>
+        </w:tabs>
+        <w:ind w:left="3600" w:hanging="360"/>
+      </w:pPr>
+    </w:lvl>
+    <w:lvl w:ilvl="5" w:tentative="1">
+      <w:start w:val="1"/>
+      <w:numFmt w:val="decimal"/>
+      <w:lvlText w:val="%6."/>
+      <w:lvlJc w:val="left"/>
+      <w:pPr>
+        <w:tabs>
+          <w:tab w:val="num" w:pos="4320"/>
+        </w:tabs>
+        <w:ind w:left="4320" w:hanging="360"/>
+      </w:pPr>
+    </w:lvl>
+    <w:lvl w:ilvl="6" w:tentative="1">
+      <w:start w:val="1"/>
+      <w:numFmt w:val="decimal"/>
+      <w:lvlText w:val="%7."/>
+      <w:lvlJc w:val="left"/>
+      <w:pPr>
+        <w:tabs>
+          <w:tab w:val="num" w:pos="5040"/>
+        </w:tabs>
+        <w:ind w:left="5040" w:hanging="360"/>
+      </w:pPr>
+    </w:lvl>
+    <w:lvl w:ilvl="7" w:tentative="1">
+      <w:start w:val="1"/>
+      <w:numFmt w:val="decimal"/>
+      <w:lvlText w:val="%8."/>
+      <w:lvlJc w:val="left"/>
+      <w:pPr>
+        <w:tabs>
+          <w:tab w:val="num" w:pos="5760"/>
+        </w:tabs>
+        <w:ind w:left="5760" w:hanging="360"/>
+      </w:pPr>
+    </w:lvl>
+    <w:lvl w:ilvl="8" w:tentative="1">
+      <w:start w:val="1"/>
+      <w:numFmt w:val="decimal"/>
+      <w:lvlText w:val="%9."/>
+      <w:lvlJc w:val="left"/>
+      <w:pPr>
+        <w:tabs>
+          <w:tab w:val="num" w:pos="6480"/>
+        </w:tabs>
+        <w:ind w:left="6480" w:hanging="360"/>
+      </w:pPr>
+    </w:lvl>
+  </w:abstractNum>
+  <w:abstractNum w:abstractNumId="16" w15:restartNumberingAfterBreak="0">
     <w:nsid w:val="25EA383C"/>
     <w:multiLevelType w:val="multilevel"/>
     <w:tmpl w:val="1130C7F0"/>
@@ -3447,7 +4374,7 @@
       </w:rPr>
     </w:lvl>
   </w:abstractNum>
-  <w:abstractNum w:abstractNumId="15" w15:restartNumberingAfterBreak="0">
+  <w:abstractNum w:abstractNumId="17" w15:restartNumberingAfterBreak="0">
     <w:nsid w:val="260B3191"/>
     <w:multiLevelType w:val="multilevel"/>
     <w:tmpl w:val="7E8420C4"/>
@@ -3596,7 +4523,7 @@
       </w:rPr>
     </w:lvl>
   </w:abstractNum>
-  <w:abstractNum w:abstractNumId="16" w15:restartNumberingAfterBreak="0">
+  <w:abstractNum w:abstractNumId="18" w15:restartNumberingAfterBreak="0">
     <w:nsid w:val="2C805C25"/>
     <w:multiLevelType w:val="multilevel"/>
     <w:tmpl w:val="8D06B470"/>
@@ -3745,7 +4672,7 @@
       </w:rPr>
     </w:lvl>
   </w:abstractNum>
-  <w:abstractNum w:abstractNumId="17" w15:restartNumberingAfterBreak="0">
+  <w:abstractNum w:abstractNumId="19" w15:restartNumberingAfterBreak="0">
     <w:nsid w:val="2D6E08E9"/>
     <w:multiLevelType w:val="multilevel"/>
     <w:tmpl w:val="E82EDC16"/>
@@ -3894,7 +4821,7 @@
       </w:rPr>
     </w:lvl>
   </w:abstractNum>
-  <w:abstractNum w:abstractNumId="18" w15:restartNumberingAfterBreak="0">
+  <w:abstractNum w:abstractNumId="20" w15:restartNumberingAfterBreak="0">
     <w:nsid w:val="2DD047F8"/>
     <w:multiLevelType w:val="multilevel"/>
     <w:tmpl w:val="91D055BC"/>
@@ -4043,7 +4970,156 @@
       </w:rPr>
     </w:lvl>
   </w:abstractNum>
-  <w:abstractNum w:abstractNumId="19" w15:restartNumberingAfterBreak="0">
+  <w:abstractNum w:abstractNumId="21" w15:restartNumberingAfterBreak="0">
+    <w:nsid w:val="2EEC5900"/>
+    <w:multiLevelType w:val="multilevel"/>
+    <w:tmpl w:val="5D60ABE0"/>
+    <w:lvl w:ilvl="0">
+      <w:start w:val="1"/>
+      <w:numFmt w:val="bullet"/>
+      <w:lvlText w:val=""/>
+      <w:lvlJc w:val="left"/>
+      <w:pPr>
+        <w:tabs>
+          <w:tab w:val="num" w:pos="720"/>
+        </w:tabs>
+        <w:ind w:left="720" w:hanging="360"/>
+      </w:pPr>
+      <w:rPr>
+        <w:rFonts w:ascii="Symbol" w:hAnsi="Symbol" w:hint="default"/>
+        <w:sz w:val="20"/>
+      </w:rPr>
+    </w:lvl>
+    <w:lvl w:ilvl="1" w:tentative="1">
+      <w:start w:val="1"/>
+      <w:numFmt w:val="bullet"/>
+      <w:lvlText w:val="o"/>
+      <w:lvlJc w:val="left"/>
+      <w:pPr>
+        <w:tabs>
+          <w:tab w:val="num" w:pos="1440"/>
+        </w:tabs>
+        <w:ind w:left="1440" w:hanging="360"/>
+      </w:pPr>
+      <w:rPr>
+        <w:rFonts w:ascii="Courier New" w:hAnsi="Courier New" w:hint="default"/>
+        <w:sz w:val="20"/>
+      </w:rPr>
+    </w:lvl>
+    <w:lvl w:ilvl="2" w:tentative="1">
+      <w:start w:val="1"/>
+      <w:numFmt w:val="bullet"/>
+      <w:lvlText w:val=""/>
+      <w:lvlJc w:val="left"/>
+      <w:pPr>
+        <w:tabs>
+          <w:tab w:val="num" w:pos="2160"/>
+        </w:tabs>
+        <w:ind w:left="2160" w:hanging="360"/>
+      </w:pPr>
+      <w:rPr>
+        <w:rFonts w:ascii="Wingdings" w:hAnsi="Wingdings" w:hint="default"/>
+        <w:sz w:val="20"/>
+      </w:rPr>
+    </w:lvl>
+    <w:lvl w:ilvl="3" w:tentative="1">
+      <w:start w:val="1"/>
+      <w:numFmt w:val="bullet"/>
+      <w:lvlText w:val=""/>
+      <w:lvlJc w:val="left"/>
+      <w:pPr>
+        <w:tabs>
+          <w:tab w:val="num" w:pos="2880"/>
+        </w:tabs>
+        <w:ind w:left="2880" w:hanging="360"/>
+      </w:pPr>
+      <w:rPr>
+        <w:rFonts w:ascii="Wingdings" w:hAnsi="Wingdings" w:hint="default"/>
+        <w:sz w:val="20"/>
+      </w:rPr>
+    </w:lvl>
+    <w:lvl w:ilvl="4" w:tentative="1">
+      <w:start w:val="1"/>
+      <w:numFmt w:val="bullet"/>
+      <w:lvlText w:val=""/>
+      <w:lvlJc w:val="left"/>
+      <w:pPr>
+        <w:tabs>
+          <w:tab w:val="num" w:pos="3600"/>
+        </w:tabs>
+        <w:ind w:left="3600" w:hanging="360"/>
+      </w:pPr>
+      <w:rPr>
+        <w:rFonts w:ascii="Wingdings" w:hAnsi="Wingdings" w:hint="default"/>
+        <w:sz w:val="20"/>
+      </w:rPr>
+    </w:lvl>
+    <w:lvl w:ilvl="5" w:tentative="1">
+      <w:start w:val="1"/>
+      <w:numFmt w:val="bullet"/>
+      <w:lvlText w:val=""/>
+      <w:lvlJc w:val="left"/>
+      <w:pPr>
+        <w:tabs>
+          <w:tab w:val="num" w:pos="4320"/>
+        </w:tabs>
+        <w:ind w:left="4320" w:hanging="360"/>
+      </w:pPr>
+      <w:rPr>
+        <w:rFonts w:ascii="Wingdings" w:hAnsi="Wingdings" w:hint="default"/>
+        <w:sz w:val="20"/>
+      </w:rPr>
+    </w:lvl>
+    <w:lvl w:ilvl="6" w:tentative="1">
+      <w:start w:val="1"/>
+      <w:numFmt w:val="bullet"/>
+      <w:lvlText w:val=""/>
+      <w:lvlJc w:val="left"/>
+      <w:pPr>
+        <w:tabs>
+          <w:tab w:val="num" w:pos="5040"/>
+        </w:tabs>
+        <w:ind w:left="5040" w:hanging="360"/>
+      </w:pPr>
+      <w:rPr>
+        <w:rFonts w:ascii="Wingdings" w:hAnsi="Wingdings" w:hint="default"/>
+        <w:sz w:val="20"/>
+      </w:rPr>
+    </w:lvl>
+    <w:lvl w:ilvl="7" w:tentative="1">
+      <w:start w:val="1"/>
+      <w:numFmt w:val="bullet"/>
+      <w:lvlText w:val=""/>
+      <w:lvlJc w:val="left"/>
+      <w:pPr>
+        <w:tabs>
+          <w:tab w:val="num" w:pos="5760"/>
+        </w:tabs>
+        <w:ind w:left="5760" w:hanging="360"/>
+      </w:pPr>
+      <w:rPr>
+        <w:rFonts w:ascii="Wingdings" w:hAnsi="Wingdings" w:hint="default"/>
+        <w:sz w:val="20"/>
+      </w:rPr>
+    </w:lvl>
+    <w:lvl w:ilvl="8" w:tentative="1">
+      <w:start w:val="1"/>
+      <w:numFmt w:val="bullet"/>
+      <w:lvlText w:val=""/>
+      <w:lvlJc w:val="left"/>
+      <w:pPr>
+        <w:tabs>
+          <w:tab w:val="num" w:pos="6480"/>
+        </w:tabs>
+        <w:ind w:left="6480" w:hanging="360"/>
+      </w:pPr>
+      <w:rPr>
+        <w:rFonts w:ascii="Wingdings" w:hAnsi="Wingdings" w:hint="default"/>
+        <w:sz w:val="20"/>
+      </w:rPr>
+    </w:lvl>
+  </w:abstractNum>
+  <w:abstractNum w:abstractNumId="22" w15:restartNumberingAfterBreak="0">
     <w:nsid w:val="3011438B"/>
     <w:multiLevelType w:val="multilevel"/>
     <w:tmpl w:val="F9D049C2"/>
@@ -4192,7 +5268,7 @@
       </w:rPr>
     </w:lvl>
   </w:abstractNum>
-  <w:abstractNum w:abstractNumId="20" w15:restartNumberingAfterBreak="0">
+  <w:abstractNum w:abstractNumId="23" w15:restartNumberingAfterBreak="0">
     <w:nsid w:val="31AC57FC"/>
     <w:multiLevelType w:val="multilevel"/>
     <w:tmpl w:val="3F1464A8"/>
@@ -4341,7 +5417,7 @@
       </w:rPr>
     </w:lvl>
   </w:abstractNum>
-  <w:abstractNum w:abstractNumId="21" w15:restartNumberingAfterBreak="0">
+  <w:abstractNum w:abstractNumId="24" w15:restartNumberingAfterBreak="0">
     <w:nsid w:val="3A8A0A66"/>
     <w:multiLevelType w:val="multilevel"/>
     <w:tmpl w:val="13782982"/>
@@ -4490,7 +5566,7 @@
       </w:rPr>
     </w:lvl>
   </w:abstractNum>
-  <w:abstractNum w:abstractNumId="22" w15:restartNumberingAfterBreak="0">
+  <w:abstractNum w:abstractNumId="25" w15:restartNumberingAfterBreak="0">
     <w:nsid w:val="3FF9740B"/>
     <w:multiLevelType w:val="multilevel"/>
     <w:tmpl w:val="3B721868"/>
@@ -4639,7 +5715,305 @@
       </w:rPr>
     </w:lvl>
   </w:abstractNum>
-  <w:abstractNum w:abstractNumId="23" w15:restartNumberingAfterBreak="0">
+  <w:abstractNum w:abstractNumId="26" w15:restartNumberingAfterBreak="0">
+    <w:nsid w:val="4030288D"/>
+    <w:multiLevelType w:val="multilevel"/>
+    <w:tmpl w:val="CFD0DE40"/>
+    <w:lvl w:ilvl="0">
+      <w:start w:val="1"/>
+      <w:numFmt w:val="bullet"/>
+      <w:lvlText w:val=""/>
+      <w:lvlJc w:val="left"/>
+      <w:pPr>
+        <w:tabs>
+          <w:tab w:val="num" w:pos="720"/>
+        </w:tabs>
+        <w:ind w:left="720" w:hanging="360"/>
+      </w:pPr>
+      <w:rPr>
+        <w:rFonts w:ascii="Symbol" w:hAnsi="Symbol" w:hint="default"/>
+        <w:sz w:val="20"/>
+      </w:rPr>
+    </w:lvl>
+    <w:lvl w:ilvl="1" w:tentative="1">
+      <w:start w:val="1"/>
+      <w:numFmt w:val="bullet"/>
+      <w:lvlText w:val="o"/>
+      <w:lvlJc w:val="left"/>
+      <w:pPr>
+        <w:tabs>
+          <w:tab w:val="num" w:pos="1440"/>
+        </w:tabs>
+        <w:ind w:left="1440" w:hanging="360"/>
+      </w:pPr>
+      <w:rPr>
+        <w:rFonts w:ascii="Courier New" w:hAnsi="Courier New" w:hint="default"/>
+        <w:sz w:val="20"/>
+      </w:rPr>
+    </w:lvl>
+    <w:lvl w:ilvl="2" w:tentative="1">
+      <w:start w:val="1"/>
+      <w:numFmt w:val="bullet"/>
+      <w:lvlText w:val=""/>
+      <w:lvlJc w:val="left"/>
+      <w:pPr>
+        <w:tabs>
+          <w:tab w:val="num" w:pos="2160"/>
+        </w:tabs>
+        <w:ind w:left="2160" w:hanging="360"/>
+      </w:pPr>
+      <w:rPr>
+        <w:rFonts w:ascii="Wingdings" w:hAnsi="Wingdings" w:hint="default"/>
+        <w:sz w:val="20"/>
+      </w:rPr>
+    </w:lvl>
+    <w:lvl w:ilvl="3" w:tentative="1">
+      <w:start w:val="1"/>
+      <w:numFmt w:val="bullet"/>
+      <w:lvlText w:val=""/>
+      <w:lvlJc w:val="left"/>
+      <w:pPr>
+        <w:tabs>
+          <w:tab w:val="num" w:pos="2880"/>
+        </w:tabs>
+        <w:ind w:left="2880" w:hanging="360"/>
+      </w:pPr>
+      <w:rPr>
+        <w:rFonts w:ascii="Wingdings" w:hAnsi="Wingdings" w:hint="default"/>
+        <w:sz w:val="20"/>
+      </w:rPr>
+    </w:lvl>
+    <w:lvl w:ilvl="4" w:tentative="1">
+      <w:start w:val="1"/>
+      <w:numFmt w:val="bullet"/>
+      <w:lvlText w:val=""/>
+      <w:lvlJc w:val="left"/>
+      <w:pPr>
+        <w:tabs>
+          <w:tab w:val="num" w:pos="3600"/>
+        </w:tabs>
+        <w:ind w:left="3600" w:hanging="360"/>
+      </w:pPr>
+      <w:rPr>
+        <w:rFonts w:ascii="Wingdings" w:hAnsi="Wingdings" w:hint="default"/>
+        <w:sz w:val="20"/>
+      </w:rPr>
+    </w:lvl>
+    <w:lvl w:ilvl="5" w:tentative="1">
+      <w:start w:val="1"/>
+      <w:numFmt w:val="bullet"/>
+      <w:lvlText w:val=""/>
+      <w:lvlJc w:val="left"/>
+      <w:pPr>
+        <w:tabs>
+          <w:tab w:val="num" w:pos="4320"/>
+        </w:tabs>
+        <w:ind w:left="4320" w:hanging="360"/>
+      </w:pPr>
+      <w:rPr>
+        <w:rFonts w:ascii="Wingdings" w:hAnsi="Wingdings" w:hint="default"/>
+        <w:sz w:val="20"/>
+      </w:rPr>
+    </w:lvl>
+    <w:lvl w:ilvl="6" w:tentative="1">
+      <w:start w:val="1"/>
+      <w:numFmt w:val="bullet"/>
+      <w:lvlText w:val=""/>
+      <w:lvlJc w:val="left"/>
+      <w:pPr>
+        <w:tabs>
+          <w:tab w:val="num" w:pos="5040"/>
+        </w:tabs>
+        <w:ind w:left="5040" w:hanging="360"/>
+      </w:pPr>
+      <w:rPr>
+        <w:rFonts w:ascii="Wingdings" w:hAnsi="Wingdings" w:hint="default"/>
+        <w:sz w:val="20"/>
+      </w:rPr>
+    </w:lvl>
+    <w:lvl w:ilvl="7" w:tentative="1">
+      <w:start w:val="1"/>
+      <w:numFmt w:val="bullet"/>
+      <w:lvlText w:val=""/>
+      <w:lvlJc w:val="left"/>
+      <w:pPr>
+        <w:tabs>
+          <w:tab w:val="num" w:pos="5760"/>
+        </w:tabs>
+        <w:ind w:left="5760" w:hanging="360"/>
+      </w:pPr>
+      <w:rPr>
+        <w:rFonts w:ascii="Wingdings" w:hAnsi="Wingdings" w:hint="default"/>
+        <w:sz w:val="20"/>
+      </w:rPr>
+    </w:lvl>
+    <w:lvl w:ilvl="8" w:tentative="1">
+      <w:start w:val="1"/>
+      <w:numFmt w:val="bullet"/>
+      <w:lvlText w:val=""/>
+      <w:lvlJc w:val="left"/>
+      <w:pPr>
+        <w:tabs>
+          <w:tab w:val="num" w:pos="6480"/>
+        </w:tabs>
+        <w:ind w:left="6480" w:hanging="360"/>
+      </w:pPr>
+      <w:rPr>
+        <w:rFonts w:ascii="Wingdings" w:hAnsi="Wingdings" w:hint="default"/>
+        <w:sz w:val="20"/>
+      </w:rPr>
+    </w:lvl>
+  </w:abstractNum>
+  <w:abstractNum w:abstractNumId="27" w15:restartNumberingAfterBreak="0">
+    <w:nsid w:val="404B451E"/>
+    <w:multiLevelType w:val="multilevel"/>
+    <w:tmpl w:val="BA0277D4"/>
+    <w:lvl w:ilvl="0">
+      <w:start w:val="1"/>
+      <w:numFmt w:val="bullet"/>
+      <w:lvlText w:val=""/>
+      <w:lvlJc w:val="left"/>
+      <w:pPr>
+        <w:tabs>
+          <w:tab w:val="num" w:pos="720"/>
+        </w:tabs>
+        <w:ind w:left="720" w:hanging="360"/>
+      </w:pPr>
+      <w:rPr>
+        <w:rFonts w:ascii="Symbol" w:hAnsi="Symbol" w:hint="default"/>
+        <w:sz w:val="20"/>
+      </w:rPr>
+    </w:lvl>
+    <w:lvl w:ilvl="1" w:tentative="1">
+      <w:start w:val="1"/>
+      <w:numFmt w:val="bullet"/>
+      <w:lvlText w:val="o"/>
+      <w:lvlJc w:val="left"/>
+      <w:pPr>
+        <w:tabs>
+          <w:tab w:val="num" w:pos="1440"/>
+        </w:tabs>
+        <w:ind w:left="1440" w:hanging="360"/>
+      </w:pPr>
+      <w:rPr>
+        <w:rFonts w:ascii="Courier New" w:hAnsi="Courier New" w:hint="default"/>
+        <w:sz w:val="20"/>
+      </w:rPr>
+    </w:lvl>
+    <w:lvl w:ilvl="2" w:tentative="1">
+      <w:start w:val="1"/>
+      <w:numFmt w:val="bullet"/>
+      <w:lvlText w:val=""/>
+      <w:lvlJc w:val="left"/>
+      <w:pPr>
+        <w:tabs>
+          <w:tab w:val="num" w:pos="2160"/>
+        </w:tabs>
+        <w:ind w:left="2160" w:hanging="360"/>
+      </w:pPr>
+      <w:rPr>
+        <w:rFonts w:ascii="Wingdings" w:hAnsi="Wingdings" w:hint="default"/>
+        <w:sz w:val="20"/>
+      </w:rPr>
+    </w:lvl>
+    <w:lvl w:ilvl="3" w:tentative="1">
+      <w:start w:val="1"/>
+      <w:numFmt w:val="bullet"/>
+      <w:lvlText w:val=""/>
+      <w:lvlJc w:val="left"/>
+      <w:pPr>
+        <w:tabs>
+          <w:tab w:val="num" w:pos="2880"/>
+        </w:tabs>
+        <w:ind w:left="2880" w:hanging="360"/>
+      </w:pPr>
+      <w:rPr>
+        <w:rFonts w:ascii="Wingdings" w:hAnsi="Wingdings" w:hint="default"/>
+        <w:sz w:val="20"/>
+      </w:rPr>
+    </w:lvl>
+    <w:lvl w:ilvl="4" w:tentative="1">
+      <w:start w:val="1"/>
+      <w:numFmt w:val="bullet"/>
+      <w:lvlText w:val=""/>
+      <w:lvlJc w:val="left"/>
+      <w:pPr>
+        <w:tabs>
+          <w:tab w:val="num" w:pos="3600"/>
+        </w:tabs>
+        <w:ind w:left="3600" w:hanging="360"/>
+      </w:pPr>
+      <w:rPr>
+        <w:rFonts w:ascii="Wingdings" w:hAnsi="Wingdings" w:hint="default"/>
+        <w:sz w:val="20"/>
+      </w:rPr>
+    </w:lvl>
+    <w:lvl w:ilvl="5" w:tentative="1">
+      <w:start w:val="1"/>
+      <w:numFmt w:val="bullet"/>
+      <w:lvlText w:val=""/>
+      <w:lvlJc w:val="left"/>
+      <w:pPr>
+        <w:tabs>
+          <w:tab w:val="num" w:pos="4320"/>
+        </w:tabs>
+        <w:ind w:left="4320" w:hanging="360"/>
+      </w:pPr>
+      <w:rPr>
+        <w:rFonts w:ascii="Wingdings" w:hAnsi="Wingdings" w:hint="default"/>
+        <w:sz w:val="20"/>
+      </w:rPr>
+    </w:lvl>
+    <w:lvl w:ilvl="6" w:tentative="1">
+      <w:start w:val="1"/>
+      <w:numFmt w:val="bullet"/>
+      <w:lvlText w:val=""/>
+      <w:lvlJc w:val="left"/>
+      <w:pPr>
+        <w:tabs>
+          <w:tab w:val="num" w:pos="5040"/>
+        </w:tabs>
+        <w:ind w:left="5040" w:hanging="360"/>
+      </w:pPr>
+      <w:rPr>
+        <w:rFonts w:ascii="Wingdings" w:hAnsi="Wingdings" w:hint="default"/>
+        <w:sz w:val="20"/>
+      </w:rPr>
+    </w:lvl>
+    <w:lvl w:ilvl="7" w:tentative="1">
+      <w:start w:val="1"/>
+      <w:numFmt w:val="bullet"/>
+      <w:lvlText w:val=""/>
+      <w:lvlJc w:val="left"/>
+      <w:pPr>
+        <w:tabs>
+          <w:tab w:val="num" w:pos="5760"/>
+        </w:tabs>
+        <w:ind w:left="5760" w:hanging="360"/>
+      </w:pPr>
+      <w:rPr>
+        <w:rFonts w:ascii="Wingdings" w:hAnsi="Wingdings" w:hint="default"/>
+        <w:sz w:val="20"/>
+      </w:rPr>
+    </w:lvl>
+    <w:lvl w:ilvl="8" w:tentative="1">
+      <w:start w:val="1"/>
+      <w:numFmt w:val="bullet"/>
+      <w:lvlText w:val=""/>
+      <w:lvlJc w:val="left"/>
+      <w:pPr>
+        <w:tabs>
+          <w:tab w:val="num" w:pos="6480"/>
+        </w:tabs>
+        <w:ind w:left="6480" w:hanging="360"/>
+      </w:pPr>
+      <w:rPr>
+        <w:rFonts w:ascii="Wingdings" w:hAnsi="Wingdings" w:hint="default"/>
+        <w:sz w:val="20"/>
+      </w:rPr>
+    </w:lvl>
+  </w:abstractNum>
+  <w:abstractNum w:abstractNumId="28" w15:restartNumberingAfterBreak="0">
     <w:nsid w:val="41190BA1"/>
     <w:multiLevelType w:val="multilevel"/>
     <w:tmpl w:val="91E6976A"/>
@@ -4752,7 +6126,7 @@
       </w:pPr>
     </w:lvl>
   </w:abstractNum>
-  <w:abstractNum w:abstractNumId="24" w15:restartNumberingAfterBreak="0">
+  <w:abstractNum w:abstractNumId="29" w15:restartNumberingAfterBreak="0">
     <w:nsid w:val="41C97937"/>
     <w:multiLevelType w:val="multilevel"/>
     <w:tmpl w:val="034CB990"/>
@@ -4901,7 +6275,7 @@
       </w:rPr>
     </w:lvl>
   </w:abstractNum>
-  <w:abstractNum w:abstractNumId="25" w15:restartNumberingAfterBreak="0">
+  <w:abstractNum w:abstractNumId="30" w15:restartNumberingAfterBreak="0">
     <w:nsid w:val="44900775"/>
     <w:multiLevelType w:val="multilevel"/>
     <w:tmpl w:val="9ADEC51C"/>
@@ -5050,7 +6424,269 @@
       </w:rPr>
     </w:lvl>
   </w:abstractNum>
-  <w:abstractNum w:abstractNumId="26" w15:restartNumberingAfterBreak="0">
+  <w:abstractNum w:abstractNumId="31" w15:restartNumberingAfterBreak="0">
+    <w:nsid w:val="46EA3AF0"/>
+    <w:multiLevelType w:val="multilevel"/>
+    <w:tmpl w:val="934EB526"/>
+    <w:lvl w:ilvl="0">
+      <w:start w:val="1"/>
+      <w:numFmt w:val="decimal"/>
+      <w:lvlText w:val="%1."/>
+      <w:lvlJc w:val="left"/>
+      <w:pPr>
+        <w:tabs>
+          <w:tab w:val="num" w:pos="720"/>
+        </w:tabs>
+        <w:ind w:left="720" w:hanging="360"/>
+      </w:pPr>
+    </w:lvl>
+    <w:lvl w:ilvl="1" w:tentative="1">
+      <w:start w:val="1"/>
+      <w:numFmt w:val="decimal"/>
+      <w:lvlText w:val="%2."/>
+      <w:lvlJc w:val="left"/>
+      <w:pPr>
+        <w:tabs>
+          <w:tab w:val="num" w:pos="1440"/>
+        </w:tabs>
+        <w:ind w:left="1440" w:hanging="360"/>
+      </w:pPr>
+    </w:lvl>
+    <w:lvl w:ilvl="2" w:tentative="1">
+      <w:start w:val="1"/>
+      <w:numFmt w:val="decimal"/>
+      <w:lvlText w:val="%3."/>
+      <w:lvlJc w:val="left"/>
+      <w:pPr>
+        <w:tabs>
+          <w:tab w:val="num" w:pos="2160"/>
+        </w:tabs>
+        <w:ind w:left="2160" w:hanging="360"/>
+      </w:pPr>
+    </w:lvl>
+    <w:lvl w:ilvl="3" w:tentative="1">
+      <w:start w:val="1"/>
+      <w:numFmt w:val="decimal"/>
+      <w:lvlText w:val="%4."/>
+      <w:lvlJc w:val="left"/>
+      <w:pPr>
+        <w:tabs>
+          <w:tab w:val="num" w:pos="2880"/>
+        </w:tabs>
+        <w:ind w:left="2880" w:hanging="360"/>
+      </w:pPr>
+    </w:lvl>
+    <w:lvl w:ilvl="4" w:tentative="1">
+      <w:start w:val="1"/>
+      <w:numFmt w:val="decimal"/>
+      <w:lvlText w:val="%5."/>
+      <w:lvlJc w:val="left"/>
+      <w:pPr>
+        <w:tabs>
+          <w:tab w:val="num" w:pos="3600"/>
+        </w:tabs>
+        <w:ind w:left="3600" w:hanging="360"/>
+      </w:pPr>
+    </w:lvl>
+    <w:lvl w:ilvl="5" w:tentative="1">
+      <w:start w:val="1"/>
+      <w:numFmt w:val="decimal"/>
+      <w:lvlText w:val="%6."/>
+      <w:lvlJc w:val="left"/>
+      <w:pPr>
+        <w:tabs>
+          <w:tab w:val="num" w:pos="4320"/>
+        </w:tabs>
+        <w:ind w:left="4320" w:hanging="360"/>
+      </w:pPr>
+    </w:lvl>
+    <w:lvl w:ilvl="6" w:tentative="1">
+      <w:start w:val="1"/>
+      <w:numFmt w:val="decimal"/>
+      <w:lvlText w:val="%7."/>
+      <w:lvlJc w:val="left"/>
+      <w:pPr>
+        <w:tabs>
+          <w:tab w:val="num" w:pos="5040"/>
+        </w:tabs>
+        <w:ind w:left="5040" w:hanging="360"/>
+      </w:pPr>
+    </w:lvl>
+    <w:lvl w:ilvl="7" w:tentative="1">
+      <w:start w:val="1"/>
+      <w:numFmt w:val="decimal"/>
+      <w:lvlText w:val="%8."/>
+      <w:lvlJc w:val="left"/>
+      <w:pPr>
+        <w:tabs>
+          <w:tab w:val="num" w:pos="5760"/>
+        </w:tabs>
+        <w:ind w:left="5760" w:hanging="360"/>
+      </w:pPr>
+    </w:lvl>
+    <w:lvl w:ilvl="8" w:tentative="1">
+      <w:start w:val="1"/>
+      <w:numFmt w:val="decimal"/>
+      <w:lvlText w:val="%9."/>
+      <w:lvlJc w:val="left"/>
+      <w:pPr>
+        <w:tabs>
+          <w:tab w:val="num" w:pos="6480"/>
+        </w:tabs>
+        <w:ind w:left="6480" w:hanging="360"/>
+      </w:pPr>
+    </w:lvl>
+  </w:abstractNum>
+  <w:abstractNum w:abstractNumId="32" w15:restartNumberingAfterBreak="0">
+    <w:nsid w:val="47D27EEB"/>
+    <w:multiLevelType w:val="multilevel"/>
+    <w:tmpl w:val="B30410C0"/>
+    <w:lvl w:ilvl="0">
+      <w:start w:val="1"/>
+      <w:numFmt w:val="bullet"/>
+      <w:lvlText w:val=""/>
+      <w:lvlJc w:val="left"/>
+      <w:pPr>
+        <w:tabs>
+          <w:tab w:val="num" w:pos="720"/>
+        </w:tabs>
+        <w:ind w:left="720" w:hanging="360"/>
+      </w:pPr>
+      <w:rPr>
+        <w:rFonts w:ascii="Symbol" w:hAnsi="Symbol" w:hint="default"/>
+        <w:sz w:val="20"/>
+      </w:rPr>
+    </w:lvl>
+    <w:lvl w:ilvl="1" w:tentative="1">
+      <w:start w:val="1"/>
+      <w:numFmt w:val="bullet"/>
+      <w:lvlText w:val="o"/>
+      <w:lvlJc w:val="left"/>
+      <w:pPr>
+        <w:tabs>
+          <w:tab w:val="num" w:pos="1440"/>
+        </w:tabs>
+        <w:ind w:left="1440" w:hanging="360"/>
+      </w:pPr>
+      <w:rPr>
+        <w:rFonts w:ascii="Courier New" w:hAnsi="Courier New" w:hint="default"/>
+        <w:sz w:val="20"/>
+      </w:rPr>
+    </w:lvl>
+    <w:lvl w:ilvl="2" w:tentative="1">
+      <w:start w:val="1"/>
+      <w:numFmt w:val="bullet"/>
+      <w:lvlText w:val=""/>
+      <w:lvlJc w:val="left"/>
+      <w:pPr>
+        <w:tabs>
+          <w:tab w:val="num" w:pos="2160"/>
+        </w:tabs>
+        <w:ind w:left="2160" w:hanging="360"/>
+      </w:pPr>
+      <w:rPr>
+        <w:rFonts w:ascii="Wingdings" w:hAnsi="Wingdings" w:hint="default"/>
+        <w:sz w:val="20"/>
+      </w:rPr>
+    </w:lvl>
+    <w:lvl w:ilvl="3" w:tentative="1">
+      <w:start w:val="1"/>
+      <w:numFmt w:val="bullet"/>
+      <w:lvlText w:val=""/>
+      <w:lvlJc w:val="left"/>
+      <w:pPr>
+        <w:tabs>
+          <w:tab w:val="num" w:pos="2880"/>
+        </w:tabs>
+        <w:ind w:left="2880" w:hanging="360"/>
+      </w:pPr>
+      <w:rPr>
+        <w:rFonts w:ascii="Wingdings" w:hAnsi="Wingdings" w:hint="default"/>
+        <w:sz w:val="20"/>
+      </w:rPr>
+    </w:lvl>
+    <w:lvl w:ilvl="4" w:tentative="1">
+      <w:start w:val="1"/>
+      <w:numFmt w:val="bullet"/>
+      <w:lvlText w:val=""/>
+      <w:lvlJc w:val="left"/>
+      <w:pPr>
+        <w:tabs>
+          <w:tab w:val="num" w:pos="3600"/>
+        </w:tabs>
+        <w:ind w:left="3600" w:hanging="360"/>
+      </w:pPr>
+      <w:rPr>
+        <w:rFonts w:ascii="Wingdings" w:hAnsi="Wingdings" w:hint="default"/>
+        <w:sz w:val="20"/>
+      </w:rPr>
+    </w:lvl>
+    <w:lvl w:ilvl="5" w:tentative="1">
+      <w:start w:val="1"/>
+      <w:numFmt w:val="bullet"/>
+      <w:lvlText w:val=""/>
+      <w:lvlJc w:val="left"/>
+      <w:pPr>
+        <w:tabs>
+          <w:tab w:val="num" w:pos="4320"/>
+        </w:tabs>
+        <w:ind w:left="4320" w:hanging="360"/>
+      </w:pPr>
+      <w:rPr>
+        <w:rFonts w:ascii="Wingdings" w:hAnsi="Wingdings" w:hint="default"/>
+        <w:sz w:val="20"/>
+      </w:rPr>
+    </w:lvl>
+    <w:lvl w:ilvl="6" w:tentative="1">
+      <w:start w:val="1"/>
+      <w:numFmt w:val="bullet"/>
+      <w:lvlText w:val=""/>
+      <w:lvlJc w:val="left"/>
+      <w:pPr>
+        <w:tabs>
+          <w:tab w:val="num" w:pos="5040"/>
+        </w:tabs>
+        <w:ind w:left="5040" w:hanging="360"/>
+      </w:pPr>
+      <w:rPr>
+        <w:rFonts w:ascii="Wingdings" w:hAnsi="Wingdings" w:hint="default"/>
+        <w:sz w:val="20"/>
+      </w:rPr>
+    </w:lvl>
+    <w:lvl w:ilvl="7" w:tentative="1">
+      <w:start w:val="1"/>
+      <w:numFmt w:val="bullet"/>
+      <w:lvlText w:val=""/>
+      <w:lvlJc w:val="left"/>
+      <w:pPr>
+        <w:tabs>
+          <w:tab w:val="num" w:pos="5760"/>
+        </w:tabs>
+        <w:ind w:left="5760" w:hanging="360"/>
+      </w:pPr>
+      <w:rPr>
+        <w:rFonts w:ascii="Wingdings" w:hAnsi="Wingdings" w:hint="default"/>
+        <w:sz w:val="20"/>
+      </w:rPr>
+    </w:lvl>
+    <w:lvl w:ilvl="8" w:tentative="1">
+      <w:start w:val="1"/>
+      <w:numFmt w:val="bullet"/>
+      <w:lvlText w:val=""/>
+      <w:lvlJc w:val="left"/>
+      <w:pPr>
+        <w:tabs>
+          <w:tab w:val="num" w:pos="6480"/>
+        </w:tabs>
+        <w:ind w:left="6480" w:hanging="360"/>
+      </w:pPr>
+      <w:rPr>
+        <w:rFonts w:ascii="Wingdings" w:hAnsi="Wingdings" w:hint="default"/>
+        <w:sz w:val="20"/>
+      </w:rPr>
+    </w:lvl>
+  </w:abstractNum>
+  <w:abstractNum w:abstractNumId="33" w15:restartNumberingAfterBreak="0">
     <w:nsid w:val="49D0074A"/>
     <w:multiLevelType w:val="multilevel"/>
     <w:tmpl w:val="8DC2E23A"/>
@@ -5199,7 +6835,7 @@
       </w:rPr>
     </w:lvl>
   </w:abstractNum>
-  <w:abstractNum w:abstractNumId="27" w15:restartNumberingAfterBreak="0">
+  <w:abstractNum w:abstractNumId="34" w15:restartNumberingAfterBreak="0">
     <w:nsid w:val="49EA4B69"/>
     <w:multiLevelType w:val="multilevel"/>
     <w:tmpl w:val="6674D598"/>
@@ -5348,7 +6984,7 @@
       </w:rPr>
     </w:lvl>
   </w:abstractNum>
-  <w:abstractNum w:abstractNumId="28" w15:restartNumberingAfterBreak="0">
+  <w:abstractNum w:abstractNumId="35" w15:restartNumberingAfterBreak="0">
     <w:nsid w:val="4AD33BD9"/>
     <w:multiLevelType w:val="multilevel"/>
     <w:tmpl w:val="430C9780"/>
@@ -5497,7 +7133,7 @@
       </w:rPr>
     </w:lvl>
   </w:abstractNum>
-  <w:abstractNum w:abstractNumId="29" w15:restartNumberingAfterBreak="0">
+  <w:abstractNum w:abstractNumId="36" w15:restartNumberingAfterBreak="0">
     <w:nsid w:val="4D6A1C39"/>
     <w:multiLevelType w:val="multilevel"/>
     <w:tmpl w:val="CEFEA490"/>
@@ -5646,7 +7282,7 @@
       </w:rPr>
     </w:lvl>
   </w:abstractNum>
-  <w:abstractNum w:abstractNumId="30" w15:restartNumberingAfterBreak="0">
+  <w:abstractNum w:abstractNumId="37" w15:restartNumberingAfterBreak="0">
     <w:nsid w:val="50963E56"/>
     <w:multiLevelType w:val="multilevel"/>
     <w:tmpl w:val="5FCEF87A"/>
@@ -5795,7 +7431,7 @@
       </w:rPr>
     </w:lvl>
   </w:abstractNum>
-  <w:abstractNum w:abstractNumId="31" w15:restartNumberingAfterBreak="0">
+  <w:abstractNum w:abstractNumId="38" w15:restartNumberingAfterBreak="0">
     <w:nsid w:val="55992607"/>
     <w:multiLevelType w:val="multilevel"/>
     <w:tmpl w:val="39E80408"/>
@@ -5944,7 +7580,7 @@
       </w:rPr>
     </w:lvl>
   </w:abstractNum>
-  <w:abstractNum w:abstractNumId="32" w15:restartNumberingAfterBreak="0">
+  <w:abstractNum w:abstractNumId="39" w15:restartNumberingAfterBreak="0">
     <w:nsid w:val="5BAF1861"/>
     <w:multiLevelType w:val="multilevel"/>
     <w:tmpl w:val="0356391E"/>
@@ -6093,7 +7729,7 @@
       </w:rPr>
     </w:lvl>
   </w:abstractNum>
-  <w:abstractNum w:abstractNumId="33" w15:restartNumberingAfterBreak="0">
+  <w:abstractNum w:abstractNumId="40" w15:restartNumberingAfterBreak="0">
     <w:nsid w:val="5E677168"/>
     <w:multiLevelType w:val="multilevel"/>
     <w:tmpl w:val="D04EE0E2"/>
@@ -6242,7 +7878,7 @@
       </w:rPr>
     </w:lvl>
   </w:abstractNum>
-  <w:abstractNum w:abstractNumId="34" w15:restartNumberingAfterBreak="0">
+  <w:abstractNum w:abstractNumId="41" w15:restartNumberingAfterBreak="0">
     <w:nsid w:val="62466ED0"/>
     <w:multiLevelType w:val="multilevel"/>
     <w:tmpl w:val="ED4E560A"/>
@@ -6391,7 +8027,7 @@
       </w:rPr>
     </w:lvl>
   </w:abstractNum>
-  <w:abstractNum w:abstractNumId="35" w15:restartNumberingAfterBreak="0">
+  <w:abstractNum w:abstractNumId="42" w15:restartNumberingAfterBreak="0">
     <w:nsid w:val="633706AA"/>
     <w:multiLevelType w:val="multilevel"/>
     <w:tmpl w:val="CC70A0F8"/>
@@ -6540,7 +8176,7 @@
       </w:rPr>
     </w:lvl>
   </w:abstractNum>
-  <w:abstractNum w:abstractNumId="36" w15:restartNumberingAfterBreak="0">
+  <w:abstractNum w:abstractNumId="43" w15:restartNumberingAfterBreak="0">
     <w:nsid w:val="64915593"/>
     <w:multiLevelType w:val="multilevel"/>
     <w:tmpl w:val="6F58E668"/>
@@ -6689,7 +8325,7 @@
       </w:rPr>
     </w:lvl>
   </w:abstractNum>
-  <w:abstractNum w:abstractNumId="37" w15:restartNumberingAfterBreak="0">
+  <w:abstractNum w:abstractNumId="44" w15:restartNumberingAfterBreak="0">
     <w:nsid w:val="681A000B"/>
     <w:multiLevelType w:val="multilevel"/>
     <w:tmpl w:val="B8E6C6FA"/>
@@ -6838,7 +8474,7 @@
       </w:rPr>
     </w:lvl>
   </w:abstractNum>
-  <w:abstractNum w:abstractNumId="38" w15:restartNumberingAfterBreak="0">
+  <w:abstractNum w:abstractNumId="45" w15:restartNumberingAfterBreak="0">
     <w:nsid w:val="69970F61"/>
     <w:multiLevelType w:val="multilevel"/>
     <w:tmpl w:val="48F2D04C"/>
@@ -6987,7 +8623,7 @@
       </w:rPr>
     </w:lvl>
   </w:abstractNum>
-  <w:abstractNum w:abstractNumId="39" w15:restartNumberingAfterBreak="0">
+  <w:abstractNum w:abstractNumId="46" w15:restartNumberingAfterBreak="0">
     <w:nsid w:val="6E5C04A9"/>
     <w:multiLevelType w:val="multilevel"/>
     <w:tmpl w:val="E8FED56E"/>
@@ -7136,7 +8772,7 @@
       </w:rPr>
     </w:lvl>
   </w:abstractNum>
-  <w:abstractNum w:abstractNumId="40" w15:restartNumberingAfterBreak="0">
+  <w:abstractNum w:abstractNumId="47" w15:restartNumberingAfterBreak="0">
     <w:nsid w:val="72F86975"/>
     <w:multiLevelType w:val="multilevel"/>
     <w:tmpl w:val="05ACFA4C"/>
@@ -7285,7 +8921,7 @@
       </w:rPr>
     </w:lvl>
   </w:abstractNum>
-  <w:abstractNum w:abstractNumId="41" w15:restartNumberingAfterBreak="0">
+  <w:abstractNum w:abstractNumId="48" w15:restartNumberingAfterBreak="0">
     <w:nsid w:val="773159EF"/>
     <w:multiLevelType w:val="multilevel"/>
     <w:tmpl w:val="DF90121E"/>
@@ -7434,7 +9070,7 @@
       </w:rPr>
     </w:lvl>
   </w:abstractNum>
-  <w:abstractNum w:abstractNumId="42" w15:restartNumberingAfterBreak="0">
+  <w:abstractNum w:abstractNumId="49" w15:restartNumberingAfterBreak="0">
     <w:nsid w:val="784C3BC7"/>
     <w:multiLevelType w:val="multilevel"/>
     <w:tmpl w:val="117C081E"/>
@@ -7583,7 +9219,7 @@
       </w:rPr>
     </w:lvl>
   </w:abstractNum>
-  <w:abstractNum w:abstractNumId="43" w15:restartNumberingAfterBreak="0">
+  <w:abstractNum w:abstractNumId="50" w15:restartNumberingAfterBreak="0">
     <w:nsid w:val="78774613"/>
     <w:multiLevelType w:val="multilevel"/>
     <w:tmpl w:val="0B32F58E"/>
@@ -7732,7 +9368,7 @@
       </w:rPr>
     </w:lvl>
   </w:abstractNum>
-  <w:abstractNum w:abstractNumId="44" w15:restartNumberingAfterBreak="0">
+  <w:abstractNum w:abstractNumId="51" w15:restartNumberingAfterBreak="0">
     <w:nsid w:val="78AE6E5D"/>
     <w:multiLevelType w:val="multilevel"/>
     <w:tmpl w:val="60AC0582"/>
@@ -7881,7 +9517,7 @@
       </w:rPr>
     </w:lvl>
   </w:abstractNum>
-  <w:abstractNum w:abstractNumId="45" w15:restartNumberingAfterBreak="0">
+  <w:abstractNum w:abstractNumId="52" w15:restartNumberingAfterBreak="0">
     <w:nsid w:val="7BE715D7"/>
     <w:multiLevelType w:val="multilevel"/>
     <w:tmpl w:val="18E6A1AE"/>
@@ -8030,7 +9666,7 @@
       </w:rPr>
     </w:lvl>
   </w:abstractNum>
-  <w:abstractNum w:abstractNumId="46" w15:restartNumberingAfterBreak="0">
+  <w:abstractNum w:abstractNumId="53" w15:restartNumberingAfterBreak="0">
     <w:nsid w:val="7D381001"/>
     <w:multiLevelType w:val="multilevel"/>
     <w:tmpl w:val="713EE468"/>
@@ -8179,7 +9815,7 @@
       </w:rPr>
     </w:lvl>
   </w:abstractNum>
-  <w:abstractNum w:abstractNumId="47" w15:restartNumberingAfterBreak="0">
+  <w:abstractNum w:abstractNumId="54" w15:restartNumberingAfterBreak="0">
     <w:nsid w:val="7F16395C"/>
     <w:multiLevelType w:val="multilevel"/>
     <w:tmpl w:val="58AE908E"/>
@@ -8329,19 +9965,19 @@
     </w:lvl>
   </w:abstractNum>
   <w:num w:numId="1" w16cid:durableId="147209456">
-    <w:abstractNumId w:val="43"/>
+    <w:abstractNumId w:val="50"/>
   </w:num>
   <w:num w:numId="2" w16cid:durableId="1925450311">
     <w:abstractNumId w:val="1"/>
   </w:num>
   <w:num w:numId="3" w16cid:durableId="140736858">
+    <w:abstractNumId w:val="44"/>
+  </w:num>
+  <w:num w:numId="4" w16cid:durableId="114711794">
     <w:abstractNumId w:val="37"/>
   </w:num>
-  <w:num w:numId="4" w16cid:durableId="114711794">
-    <w:abstractNumId w:val="30"/>
-  </w:num>
   <w:num w:numId="5" w16cid:durableId="1451899751">
-    <w:abstractNumId w:val="38"/>
+    <w:abstractNumId w:val="45"/>
   </w:num>
   <w:num w:numId="6" w16cid:durableId="1346900783">
     <w:abstractNumId w:val="7"/>
@@ -8350,97 +9986,97 @@
     <w:abstractNumId w:val="6"/>
   </w:num>
   <w:num w:numId="8" w16cid:durableId="381444115">
-    <w:abstractNumId w:val="46"/>
+    <w:abstractNumId w:val="53"/>
   </w:num>
   <w:num w:numId="9" w16cid:durableId="1375495270">
-    <w:abstractNumId w:val="42"/>
+    <w:abstractNumId w:val="49"/>
   </w:num>
   <w:num w:numId="10" w16cid:durableId="1550411204">
-    <w:abstractNumId w:val="36"/>
+    <w:abstractNumId w:val="43"/>
   </w:num>
   <w:num w:numId="11" w16cid:durableId="1366179614">
-    <w:abstractNumId w:val="32"/>
+    <w:abstractNumId w:val="39"/>
   </w:num>
   <w:num w:numId="12" w16cid:durableId="67120812">
-    <w:abstractNumId w:val="20"/>
+    <w:abstractNumId w:val="23"/>
   </w:num>
   <w:num w:numId="13" w16cid:durableId="1766150717">
-    <w:abstractNumId w:val="21"/>
+    <w:abstractNumId w:val="24"/>
   </w:num>
   <w:num w:numId="14" w16cid:durableId="732199652">
-    <w:abstractNumId w:val="23"/>
+    <w:abstractNumId w:val="28"/>
   </w:num>
   <w:num w:numId="15" w16cid:durableId="947010871">
-    <w:abstractNumId w:val="28"/>
+    <w:abstractNumId w:val="35"/>
   </w:num>
   <w:num w:numId="16" w16cid:durableId="588659423">
     <w:abstractNumId w:val="8"/>
   </w:num>
   <w:num w:numId="17" w16cid:durableId="951744710">
-    <w:abstractNumId w:val="24"/>
+    <w:abstractNumId w:val="29"/>
   </w:num>
   <w:num w:numId="18" w16cid:durableId="2123987578">
-    <w:abstractNumId w:val="12"/>
+    <w:abstractNumId w:val="13"/>
   </w:num>
   <w:num w:numId="19" w16cid:durableId="1873227489">
-    <w:abstractNumId w:val="40"/>
+    <w:abstractNumId w:val="47"/>
   </w:num>
   <w:num w:numId="20" w16cid:durableId="1736926726">
-    <w:abstractNumId w:val="14"/>
+    <w:abstractNumId w:val="16"/>
   </w:num>
   <w:num w:numId="21" w16cid:durableId="1097017396">
-    <w:abstractNumId w:val="18"/>
+    <w:abstractNumId w:val="20"/>
   </w:num>
   <w:num w:numId="22" w16cid:durableId="331837988">
-    <w:abstractNumId w:val="10"/>
+    <w:abstractNumId w:val="11"/>
   </w:num>
   <w:num w:numId="23" w16cid:durableId="1079401535">
-    <w:abstractNumId w:val="15"/>
+    <w:abstractNumId w:val="17"/>
   </w:num>
   <w:num w:numId="24" w16cid:durableId="2012751264">
-    <w:abstractNumId w:val="19"/>
+    <w:abstractNumId w:val="22"/>
   </w:num>
   <w:num w:numId="25" w16cid:durableId="1885748127">
-    <w:abstractNumId w:val="16"/>
+    <w:abstractNumId w:val="18"/>
   </w:num>
   <w:num w:numId="26" w16cid:durableId="30421864">
     <w:abstractNumId w:val="5"/>
   </w:num>
   <w:num w:numId="27" w16cid:durableId="79638893">
-    <w:abstractNumId w:val="31"/>
+    <w:abstractNumId w:val="38"/>
   </w:num>
   <w:num w:numId="28" w16cid:durableId="1442143247">
-    <w:abstractNumId w:val="29"/>
+    <w:abstractNumId w:val="36"/>
   </w:num>
   <w:num w:numId="29" w16cid:durableId="1214192687">
-    <w:abstractNumId w:val="41"/>
+    <w:abstractNumId w:val="48"/>
   </w:num>
   <w:num w:numId="30" w16cid:durableId="925697185">
-    <w:abstractNumId w:val="39"/>
+    <w:abstractNumId w:val="46"/>
   </w:num>
   <w:num w:numId="31" w16cid:durableId="1402829949">
-    <w:abstractNumId w:val="27"/>
+    <w:abstractNumId w:val="34"/>
   </w:num>
   <w:num w:numId="32" w16cid:durableId="49769941">
     <w:abstractNumId w:val="3"/>
   </w:num>
   <w:num w:numId="33" w16cid:durableId="2086873679">
-    <w:abstractNumId w:val="35"/>
+    <w:abstractNumId w:val="42"/>
   </w:num>
   <w:num w:numId="34" w16cid:durableId="511264709">
-    <w:abstractNumId w:val="25"/>
+    <w:abstractNumId w:val="30"/>
   </w:num>
   <w:num w:numId="35" w16cid:durableId="374014222">
-    <w:abstractNumId w:val="13"/>
+    <w:abstractNumId w:val="14"/>
   </w:num>
   <w:num w:numId="36" w16cid:durableId="2127310600">
-    <w:abstractNumId w:val="9"/>
+    <w:abstractNumId w:val="10"/>
   </w:num>
   <w:num w:numId="37" w16cid:durableId="29456600">
-    <w:abstractNumId w:val="45"/>
+    <w:abstractNumId w:val="52"/>
   </w:num>
   <w:num w:numId="38" w16cid:durableId="1691681277">
-    <w:abstractNumId w:val="22"/>
+    <w:abstractNumId w:val="25"/>
   </w:num>
   <w:num w:numId="39" w16cid:durableId="89081874">
     <w:abstractNumId w:val="0"/>
@@ -8449,28 +10085,49 @@
     <w:abstractNumId w:val="4"/>
   </w:num>
   <w:num w:numId="41" w16cid:durableId="2085296368">
-    <w:abstractNumId w:val="17"/>
+    <w:abstractNumId w:val="19"/>
   </w:num>
   <w:num w:numId="42" w16cid:durableId="1962763146">
+    <w:abstractNumId w:val="40"/>
+  </w:num>
+  <w:num w:numId="43" w16cid:durableId="1472599316">
+    <w:abstractNumId w:val="51"/>
+  </w:num>
+  <w:num w:numId="44" w16cid:durableId="849372046">
     <w:abstractNumId w:val="33"/>
   </w:num>
-  <w:num w:numId="43" w16cid:durableId="1472599316">
-    <w:abstractNumId w:val="44"/>
-  </w:num>
-  <w:num w:numId="44" w16cid:durableId="849372046">
-    <w:abstractNumId w:val="26"/>
-  </w:num>
   <w:num w:numId="45" w16cid:durableId="236208552">
-    <w:abstractNumId w:val="47"/>
+    <w:abstractNumId w:val="54"/>
   </w:num>
   <w:num w:numId="46" w16cid:durableId="1202786256">
-    <w:abstractNumId w:val="11"/>
+    <w:abstractNumId w:val="12"/>
   </w:num>
   <w:num w:numId="47" w16cid:durableId="589895537">
-    <w:abstractNumId w:val="34"/>
+    <w:abstractNumId w:val="41"/>
   </w:num>
   <w:num w:numId="48" w16cid:durableId="970011654">
     <w:abstractNumId w:val="2"/>
+  </w:num>
+  <w:num w:numId="49" w16cid:durableId="584193264">
+    <w:abstractNumId w:val="21"/>
+  </w:num>
+  <w:num w:numId="50" w16cid:durableId="1967151848">
+    <w:abstractNumId w:val="26"/>
+  </w:num>
+  <w:num w:numId="51" w16cid:durableId="58065236">
+    <w:abstractNumId w:val="32"/>
+  </w:num>
+  <w:num w:numId="52" w16cid:durableId="1926449438">
+    <w:abstractNumId w:val="15"/>
+  </w:num>
+  <w:num w:numId="53" w16cid:durableId="2026052728">
+    <w:abstractNumId w:val="31"/>
+  </w:num>
+  <w:num w:numId="54" w16cid:durableId="762409930">
+    <w:abstractNumId w:val="9"/>
+  </w:num>
+  <w:num w:numId="55" w16cid:durableId="1166239281">
+    <w:abstractNumId w:val="27"/>
   </w:num>
 </w:numbering>
 </file>
@@ -9078,7 +10735,6 @@
   <w:style w:type="character" w:default="1" w:styleId="DefaultParagraphFont">
     <w:name w:val="Default Paragraph Font"/>
     <w:uiPriority w:val="1"/>
-    <w:semiHidden/>
     <w:unhideWhenUsed/>
   </w:style>
   <w:style w:type="table" w:default="1" w:styleId="TableNormal">

</xml_diff>